<commit_message>
update file name baocao
</commit_message>
<xml_diff>
--- a/04_BaoCao/FIT4009.0279101043.TranXuanKhu.D0325HNCNA1.docx
+++ b/04_BaoCao/FIT4009.0279101043.TranXuanKhu.D0325HNCNA1.docx
@@ -2292,12 +2292,12 @@
           <wp:inline distB="114300" distT="114300" distL="114300" distR="114300">
             <wp:extent cx="5486400" cy="4165600"/>
             <wp:effectExtent b="0" l="0" r="0" t="0"/>
-            <wp:docPr id="2" name="image8.png"/>
+            <wp:docPr id="2" name="image4.png"/>
             <a:graphic>
               <a:graphicData uri="http://schemas.openxmlformats.org/drawingml/2006/picture">
                 <pic:pic>
                   <pic:nvPicPr>
-                    <pic:cNvPr id="0" name="image8.png"/>
+                    <pic:cNvPr id="0" name="image4.png"/>
                     <pic:cNvPicPr preferRelativeResize="0"/>
                   </pic:nvPicPr>
                   <pic:blipFill>
@@ -2381,12 +2381,12 @@
           <wp:inline distB="114300" distT="114300" distL="114300" distR="114300">
             <wp:extent cx="5486400" cy="1727200"/>
             <wp:effectExtent b="0" l="0" r="0" t="0"/>
-            <wp:docPr id="7" name="image6.png"/>
+            <wp:docPr id="7" name="image5.png"/>
             <a:graphic>
               <a:graphicData uri="http://schemas.openxmlformats.org/drawingml/2006/picture">
                 <pic:pic>
                   <pic:nvPicPr>
-                    <pic:cNvPr id="0" name="image6.png"/>
+                    <pic:cNvPr id="0" name="image5.png"/>
                     <pic:cNvPicPr preferRelativeResize="0"/>
                   </pic:nvPicPr>
                   <pic:blipFill>
@@ -2480,12 +2480,12 @@
           <wp:inline distB="114300" distT="114300" distL="114300" distR="114300">
             <wp:extent cx="5486400" cy="3733800"/>
             <wp:effectExtent b="0" l="0" r="0" t="0"/>
-            <wp:docPr id="5" name="image2.png"/>
+            <wp:docPr id="5" name="image3.png"/>
             <a:graphic>
               <a:graphicData uri="http://schemas.openxmlformats.org/drawingml/2006/picture">
                 <pic:pic>
                   <pic:nvPicPr>
-                    <pic:cNvPr id="0" name="image2.png"/>
+                    <pic:cNvPr id="0" name="image3.png"/>
                     <pic:cNvPicPr preferRelativeResize="0"/>
                   </pic:nvPicPr>
                   <pic:blipFill>
@@ -2587,12 +2587,12 @@
           <wp:inline distB="114300" distT="114300" distL="114300" distR="114300">
             <wp:extent cx="5486400" cy="2451100"/>
             <wp:effectExtent b="0" l="0" r="0" t="0"/>
-            <wp:docPr id="3" name="image7.png"/>
+            <wp:docPr id="3" name="image8.png"/>
             <a:graphic>
               <a:graphicData uri="http://schemas.openxmlformats.org/drawingml/2006/picture">
                 <pic:pic>
                   <pic:nvPicPr>
-                    <pic:cNvPr id="0" name="image7.png"/>
+                    <pic:cNvPr id="0" name="image8.png"/>
                     <pic:cNvPicPr preferRelativeResize="0"/>
                   </pic:nvPicPr>
                   <pic:blipFill>
@@ -2686,12 +2686,12 @@
           <wp:inline distB="114300" distT="114300" distL="114300" distR="114300">
             <wp:extent cx="5486400" cy="2044700"/>
             <wp:effectExtent b="0" l="0" r="0" t="0"/>
-            <wp:docPr id="8" name="image4.png"/>
+            <wp:docPr id="8" name="image6.png"/>
             <a:graphic>
               <a:graphicData uri="http://schemas.openxmlformats.org/drawingml/2006/picture">
                 <pic:pic>
                   <pic:nvPicPr>
-                    <pic:cNvPr id="0" name="image4.png"/>
+                    <pic:cNvPr id="0" name="image6.png"/>
                     <pic:cNvPicPr preferRelativeResize="0"/>
                   </pic:nvPicPr>
                   <pic:blipFill>
@@ -3436,12 +3436,12 @@
           <wp:inline distB="114300" distT="114300" distL="114300" distR="114300">
             <wp:extent cx="5486400" cy="3327400"/>
             <wp:effectExtent b="0" l="0" r="0" t="0"/>
-            <wp:docPr id="6" name="image5.png"/>
+            <wp:docPr id="6" name="image7.png"/>
             <a:graphic>
               <a:graphicData uri="http://schemas.openxmlformats.org/drawingml/2006/picture">
                 <pic:pic>
                   <pic:nvPicPr>
-                    <pic:cNvPr id="0" name="image5.png"/>
+                    <pic:cNvPr id="0" name="image7.png"/>
                     <pic:cNvPicPr preferRelativeResize="0"/>
                   </pic:nvPicPr>
                   <pic:blipFill>
@@ -3545,12 +3545,12 @@
           <wp:inline distB="114300" distT="114300" distL="114300" distR="114300">
             <wp:extent cx="5486400" cy="2463800"/>
             <wp:effectExtent b="0" l="0" r="0" t="0"/>
-            <wp:docPr id="1" name="image3.png"/>
+            <wp:docPr id="1" name="image2.png"/>
             <a:graphic>
               <a:graphicData uri="http://schemas.openxmlformats.org/drawingml/2006/picture">
                 <pic:pic>
                   <pic:nvPicPr>
-                    <pic:cNvPr id="0" name="image3.png"/>
+                    <pic:cNvPr id="0" name="image2.png"/>
                     <pic:cNvPicPr preferRelativeResize="0"/>
                   </pic:nvPicPr>
                   <pic:blipFill>
@@ -3710,7 +3710,7 @@
           <w:color w:val="c00000"/>
           <w:rtl w:val="0"/>
         </w:rPr>
-        <w:t xml:space="preserve">[Dán link GitLab Repository của dự án tại đây]</w:t>
+        <w:t xml:space="preserve">https://github.com/khutran/phantich-hethongthongtin</w:t>
       </w:r>
       <w:r>
         <w:rPr>

</xml_diff>